<commit_message>
Liste des 12 : Yohann Petiot co-rapporteur du rapport du CNC sur le commerce circulaire
Co-Authored-By: Claude Opus 5.5 <noreply@anthropic.com>
Claude-Session: https://claude.ai/code/session_01C7XiPcXpETUWAHMH28sD58
</commit_message>
<xml_diff>
--- a/note_politique/liste_12_personnes_a_interviewer_retail_France.docx
+++ b/note_politique/liste_12_personnes_a_interviewer_retail_France.docx
@@ -300,7 +300,7 @@
             </w:tcMar>
           </w:tcPr>
           <w:p>
-            <w:hyperlink w:history="1" r:id="rIdcsvfpmxkjawkoxjtlb_dq">
+            <w:hyperlink w:history="1" r:id="rId39-tbqklrxw-6dqrvpthk">
               <w:r>
                 <w:rPr>
                   <w:b/>
@@ -443,7 +443,7 @@
             </w:tcMar>
           </w:tcPr>
           <w:p>
-            <w:hyperlink w:history="1" r:id="rIdb9w5qyiomzwal_vboqaif">
+            <w:hyperlink w:history="1" r:id="rIdkukk1xazjc2o53c5ezi9k">
               <w:r>
                 <w:rPr>
                   <w:b/>
@@ -586,7 +586,7 @@
             </w:tcMar>
           </w:tcPr>
           <w:p>
-            <w:hyperlink w:history="1" r:id="rIdousktjxtwurighxmkmooe">
+            <w:hyperlink w:history="1" r:id="rId_vvk7yrib0loifkyrlbx1">
               <w:r>
                 <w:rPr>
                   <w:b/>
@@ -649,7 +649,7 @@
                 <w:sz w:val="17"/>
                 <w:szCs w:val="17"/>
               </w:rPr>
-              <w:t xml:space="preserve">Voix des enseignes de centre-ville face à l'e-commerce et à l'ultra fast fashion</w:t>
+              <w:t xml:space="preserve">Co-rapporteur du rapport du CNC « Commerce français : accélérer la transition circulaire » (janv. 2026) ; voix des enseignes de centre-ville</w:t>
             </w:r>
           </w:p>
         </w:tc>
@@ -729,7 +729,7 @@
             </w:tcMar>
           </w:tcPr>
           <w:p>
-            <w:hyperlink w:history="1" r:id="rId_tt7kdyaie9_83oimkg-r">
+            <w:hyperlink w:history="1" r:id="rIdlb5zmjh6pejclxmsymsew">
               <w:r>
                 <w:rPr>
                   <w:b/>
@@ -882,7 +882,7 @@
             </w:tcMar>
           </w:tcPr>
           <w:p>
-            <w:hyperlink w:history="1" r:id="rIdpdbofo6lqmd08si4ahkej">
+            <w:hyperlink w:history="1" r:id="rIdgrazj3xckh9nwdnbbbp7n">
               <w:r>
                 <w:rPr>
                   <w:b/>
@@ -1064,7 +1064,7 @@
             </w:tcMar>
           </w:tcPr>
           <w:p>
-            <w:hyperlink w:history="1" r:id="rIdub1i2r5ejsgv401ntn-or">
+            <w:hyperlink w:history="1" r:id="rIdyglnzwsixlmdiymr28rs4">
               <w:r>
                 <w:rPr>
                   <w:b/>
@@ -1207,7 +1207,7 @@
             </w:tcMar>
           </w:tcPr>
           <w:p>
-            <w:hyperlink w:history="1" r:id="rIdyzyny4ysdsc_744atsc7s">
+            <w:hyperlink w:history="1" r:id="rIdkb98i6aogvf1iq3zxjrtg">
               <w:r>
                 <w:rPr>
                   <w:b/>
@@ -1352,7 +1352,7 @@
             </w:tcMar>
           </w:tcPr>
           <w:p>
-            <w:hyperlink w:history="1" r:id="rIdtkh-6qxshske8lgvni9sd">
+            <w:hyperlink w:history="1" r:id="rIdn15y_qwyrvuxg-u44zzzs">
               <w:r>
                 <w:rPr>
                   <w:b/>
@@ -1495,7 +1495,7 @@
             </w:tcMar>
           </w:tcPr>
           <w:p>
-            <w:hyperlink w:history="1" r:id="rIdojsjbo0a-vctio-yfrrse">
+            <w:hyperlink w:history="1" r:id="rIdzxcjx6eeyshqln0bqn0db">
               <w:r>
                 <w:rPr>
                   <w:b/>
@@ -1677,7 +1677,7 @@
             </w:tcMar>
           </w:tcPr>
           <w:p>
-            <w:hyperlink w:history="1" r:id="rIdnieggc6dm4gualkecmfbg">
+            <w:hyperlink w:history="1" r:id="rId0metbj6zdhrvj5ylq170p">
               <w:r>
                 <w:rPr>
                   <w:b/>
@@ -1820,7 +1820,7 @@
             </w:tcMar>
           </w:tcPr>
           <w:p>
-            <w:hyperlink w:history="1" r:id="rIdfuspbrirqj_wbxrdlozcm">
+            <w:hyperlink w:history="1" r:id="rIdfk8rw3n5hi_drdjkn_-q8">
               <w:r>
                 <w:rPr>
                   <w:b/>
@@ -2961,7 +2961,7 @@
         </w:numPr>
         <w:spacing w:after="40"/>
       </w:pPr>
-      <w:hyperlink w:history="1" r:id="rIdqgtuo-zu_xd4y7xjvkfds">
+      <w:hyperlink w:history="1" r:id="rId_wvseochfpdxwwudnd-vk">
         <w:r>
           <w:rPr>
             <w:rStyle w:val="Hyperlink"/>
@@ -2981,7 +2981,7 @@
         </w:numPr>
         <w:spacing w:after="40"/>
       </w:pPr>
-      <w:hyperlink w:history="1" r:id="rIdgbhxrujup3cqzc-0zr6kv">
+      <w:hyperlink w:history="1" r:id="rIdvwxnxi2tearv_q3yjxttw">
         <w:r>
           <w:rPr>
             <w:rStyle w:val="Hyperlink"/>
@@ -3001,7 +3001,7 @@
         </w:numPr>
         <w:spacing w:after="40"/>
       </w:pPr>
-      <w:hyperlink w:history="1" r:id="rIdad3okxycyjiie7xn3fzaz">
+      <w:hyperlink w:history="1" r:id="rId45mk0verq4tjk_xd6some">
         <w:r>
           <w:rPr>
             <w:rStyle w:val="Hyperlink"/>
@@ -3021,7 +3021,27 @@
         </w:numPr>
         <w:spacing w:after="40"/>
       </w:pPr>
-      <w:hyperlink w:history="1" r:id="rIdgkcotwlmynnik9ayk_rpo">
+      <w:hyperlink w:history="1" r:id="rIdao9fahginuzsoivd1btf9">
+        <w:r>
+          <w:rPr>
+            <w:rStyle w:val="Hyperlink"/>
+            <w:sz w:val="16"/>
+            <w:szCs w:val="16"/>
+          </w:rPr>
+          <w:t xml:space="preserve">Conseil national du commerce, Commerce français : accélérer la transition circulaire, janvier 2026</w:t>
+        </w:r>
+      </w:hyperlink>
+    </w:p>
+    <w:p>
+      <w:pPr>
+        <w:pStyle w:val="ListParagraph"/>
+        <w:numPr>
+          <w:ilvl w:val="0"/>
+          <w:numId w:val="3"/>
+        </w:numPr>
+        <w:spacing w:after="40"/>
+      </w:pPr>
+      <w:hyperlink w:history="1" r:id="rIdavcv1n6shkhdjumxwsr3p">
         <w:r>
           <w:rPr>
             <w:rStyle w:val="Hyperlink"/>
@@ -3041,7 +3061,7 @@
         </w:numPr>
         <w:spacing w:after="40"/>
       </w:pPr>
-      <w:hyperlink w:history="1" r:id="rId722jdaujlif2pftrkaoel">
+      <w:hyperlink w:history="1" r:id="rIdf0u9mj-zdu59zc2jzzig8">
         <w:r>
           <w:rPr>
             <w:rStyle w:val="Hyperlink"/>
@@ -3061,7 +3081,7 @@
         </w:numPr>
         <w:spacing w:after="40"/>
       </w:pPr>
-      <w:hyperlink w:history="1" r:id="rIdqaqmn2hfoaarsyhghhg90">
+      <w:hyperlink w:history="1" r:id="rIdoubkuarckhg_3anjlcsow">
         <w:r>
           <w:rPr>
             <w:rStyle w:val="Hyperlink"/>
@@ -3081,7 +3101,7 @@
         </w:numPr>
         <w:spacing w:after="40"/>
       </w:pPr>
-      <w:hyperlink w:history="1" r:id="rIddhcixvwdvdnlm1jh6shan">
+      <w:hyperlink w:history="1" r:id="rId2stydork1m6vmgisiou4w">
         <w:r>
           <w:rPr>
             <w:rStyle w:val="Hyperlink"/>
@@ -3101,7 +3121,7 @@
         </w:numPr>
         <w:spacing w:after="40"/>
       </w:pPr>
-      <w:hyperlink w:history="1" r:id="rIdw-erci4c67fr-whqqr3bx">
+      <w:hyperlink w:history="1" r:id="rIdmv0novpjqavmtiectco-e">
         <w:r>
           <w:rPr>
             <w:rStyle w:val="Hyperlink"/>
@@ -3121,7 +3141,7 @@
         </w:numPr>
         <w:spacing w:after="40"/>
       </w:pPr>
-      <w:hyperlink w:history="1" r:id="rIdxrqfwxbuqsoijpxepoina">
+      <w:hyperlink w:history="1" r:id="rIdawv6ppfizevazdvfe0ohn">
         <w:r>
           <w:rPr>
             <w:rStyle w:val="Hyperlink"/>
@@ -3141,7 +3161,7 @@
         </w:numPr>
         <w:spacing w:after="40"/>
       </w:pPr>
-      <w:hyperlink w:history="1" r:id="rIdfgjpryrak8p-7s6ivd0oq">
+      <w:hyperlink w:history="1" r:id="rId-j_gpmv1xbs-dzfeyc_y8">
         <w:r>
           <w:rPr>
             <w:rStyle w:val="Hyperlink"/>
@@ -3161,7 +3181,7 @@
         </w:numPr>
         <w:spacing w:after="40"/>
       </w:pPr>
-      <w:hyperlink w:history="1" r:id="rId0glzvdpfdvgtxu10xv69l">
+      <w:hyperlink w:history="1" r:id="rId3v7f_xx9wc7r0nt2urrwm">
         <w:r>
           <w:rPr>
             <w:rStyle w:val="Hyperlink"/>

</xml_diff>